<commit_message>
Aula 2505 - MOBILE - Navegação exercicio
</commit_message>
<xml_diff>
--- a/SENAI/WORDS/3º SEMESTRE/Mobile/words/Aula07_navegacao.docx
+++ b/SENAI/WORDS/3º SEMESTRE/Mobile/words/Aula07_navegacao.docx
@@ -273,17 +273,15 @@
           <w:bCs/>
           <w:sz w:val="28"/>
           <w:szCs w:val="28"/>
-          <w:lang w:val="en-US"/>
-        </w:rPr>
-      </w:pPr>
-      <w:r>
-        <w:rPr>
-          <w:rFonts w:ascii="Arial" w:hAnsi="Arial"/>
-          <w:b/>
-          <w:bCs/>
-          <w:sz w:val="28"/>
-          <w:szCs w:val="28"/>
-          <w:lang w:val="en-US"/>
+        </w:rPr>
+      </w:pPr>
+      <w:r>
+        <w:rPr>
+          <w:rFonts w:ascii="Arial" w:hAnsi="Arial"/>
+          <w:b/>
+          <w:bCs/>
+          <w:sz w:val="28"/>
+          <w:szCs w:val="28"/>
         </w:rPr>
         <w:t>NavigationContainer</w:t>
       </w:r>
@@ -324,6 +322,7 @@
       <w:r>
         <w:rPr>
           <w:rFonts w:ascii="Arial" w:hAnsi="Arial"/>
+          <w:noProof/>
           <w:sz w:val="28"/>
           <w:szCs w:val="28"/>
         </w:rPr>
@@ -402,6 +401,7 @@
       <w:r>
         <w:rPr>
           <w:rFonts w:ascii="Arial" w:hAnsi="Arial"/>
+          <w:noProof/>
           <w:sz w:val="28"/>
           <w:szCs w:val="28"/>
         </w:rPr>
@@ -570,17 +570,15 @@
           <w:bCs/>
           <w:sz w:val="28"/>
           <w:szCs w:val="28"/>
-          <w:lang w:val="en-US"/>
-        </w:rPr>
-      </w:pPr>
-      <w:r>
-        <w:rPr>
-          <w:rFonts w:ascii="Arial" w:hAnsi="Arial"/>
-          <w:b/>
-          <w:bCs/>
-          <w:sz w:val="28"/>
-          <w:szCs w:val="28"/>
-          <w:lang w:val="en-US"/>
+        </w:rPr>
+      </w:pPr>
+      <w:r>
+        <w:rPr>
+          <w:rFonts w:ascii="Arial" w:hAnsi="Arial"/>
+          <w:b/>
+          <w:bCs/>
+          <w:sz w:val="28"/>
+          <w:szCs w:val="28"/>
         </w:rPr>
         <w:t>Como funciona?</w:t>
       </w:r>
@@ -596,6 +594,7 @@
       <w:r>
         <w:rPr>
           <w:rFonts w:ascii="Arial" w:hAnsi="Arial"/>
+          <w:noProof/>
           <w:sz w:val="28"/>
           <w:szCs w:val="28"/>
         </w:rPr>
@@ -855,6 +854,7 @@
           <w:rFonts w:ascii="Arial" w:hAnsi="Arial"/>
           <w:b/>
           <w:bCs/>
+          <w:noProof/>
           <w:sz w:val="28"/>
           <w:szCs w:val="28"/>
         </w:rPr>
@@ -991,6 +991,7 @@
       <w:r>
         <w:rPr>
           <w:rFonts w:ascii="Arial" w:hAnsi="Arial"/>
+          <w:noProof/>
           <w:sz w:val="28"/>
           <w:szCs w:val="28"/>
         </w:rPr>
@@ -1059,6 +1060,7 @@
       <w:r>
         <w:rPr>
           <w:rFonts w:ascii="Arial" w:hAnsi="Arial"/>
+          <w:noProof/>
           <w:sz w:val="28"/>
           <w:szCs w:val="28"/>
         </w:rPr>
@@ -1199,6 +1201,7 @@
       <w:r>
         <w:rPr>
           <w:rFonts w:ascii="Arial" w:hAnsi="Arial"/>
+          <w:noProof/>
           <w:sz w:val="28"/>
           <w:szCs w:val="28"/>
         </w:rPr>
@@ -1428,6 +1431,7 @@
       <w:r>
         <w:rPr>
           <w:rFonts w:ascii="Arial" w:hAnsi="Arial"/>
+          <w:noProof/>
           <w:sz w:val="28"/>
           <w:szCs w:val="28"/>
         </w:rPr>
@@ -1496,6 +1500,7 @@
       <w:r>
         <w:rPr>
           <w:rFonts w:ascii="Arial" w:hAnsi="Arial"/>
+          <w:noProof/>
           <w:sz w:val="28"/>
           <w:szCs w:val="28"/>
         </w:rPr>
@@ -1524,6 +1529,846 @@
                     <a:xfrm>
                       <a:off x="0" y="0"/>
                       <a:ext cx="5400040" cy="1102360"/>
+                    </a:xfrm>
+                    <a:prstGeom prst="rect">
+                      <a:avLst/>
+                    </a:prstGeom>
+                  </pic:spPr>
+                </pic:pic>
+              </a:graphicData>
+            </a:graphic>
+          </wp:inline>
+        </w:drawing>
+      </w:r>
+    </w:p>
+    <w:p>
+      <w:pPr>
+        <w:rPr>
+          <w:rFonts w:ascii="Arial" w:hAnsi="Arial"/>
+          <w:sz w:val="28"/>
+          <w:szCs w:val="28"/>
+        </w:rPr>
+      </w:pPr>
+    </w:p>
+    <w:p>
+      <w:pPr>
+        <w:rPr>
+          <w:rFonts w:ascii="Arial" w:hAnsi="Arial"/>
+          <w:sz w:val="28"/>
+          <w:szCs w:val="28"/>
+        </w:rPr>
+      </w:pPr>
+    </w:p>
+    <w:p>
+      <w:pPr>
+        <w:rPr>
+          <w:rFonts w:ascii="Arial" w:hAnsi="Arial"/>
+          <w:sz w:val="28"/>
+          <w:szCs w:val="28"/>
+        </w:rPr>
+      </w:pPr>
+    </w:p>
+    <w:p>
+      <w:pPr>
+        <w:rPr>
+          <w:rFonts w:ascii="Arial" w:hAnsi="Arial"/>
+          <w:sz w:val="28"/>
+          <w:szCs w:val="28"/>
+        </w:rPr>
+      </w:pPr>
+    </w:p>
+    <w:p>
+      <w:pPr>
+        <w:rPr>
+          <w:rFonts w:ascii="Arial" w:hAnsi="Arial"/>
+          <w:sz w:val="28"/>
+          <w:szCs w:val="28"/>
+        </w:rPr>
+      </w:pPr>
+    </w:p>
+    <w:p>
+      <w:pPr>
+        <w:rPr>
+          <w:rFonts w:ascii="Arial" w:hAnsi="Arial"/>
+          <w:sz w:val="28"/>
+          <w:szCs w:val="28"/>
+        </w:rPr>
+      </w:pPr>
+    </w:p>
+    <w:p>
+      <w:pPr>
+        <w:rPr>
+          <w:rFonts w:ascii="Arial" w:hAnsi="Arial"/>
+          <w:b/>
+          <w:bCs/>
+          <w:sz w:val="28"/>
+          <w:szCs w:val="28"/>
+        </w:rPr>
+      </w:pPr>
+      <w:r>
+        <w:rPr>
+          <w:rFonts w:ascii="Arial" w:hAnsi="Arial"/>
+          <w:b/>
+          <w:bCs/>
+          <w:sz w:val="28"/>
+          <w:szCs w:val="28"/>
+        </w:rPr>
+        <w:lastRenderedPageBreak/>
+        <w:t>Bottom Tab</w:t>
+      </w:r>
+      <w:r>
+        <w:rPr>
+          <w:rFonts w:ascii="Arial" w:hAnsi="Arial"/>
+          <w:b/>
+          <w:bCs/>
+          <w:sz w:val="28"/>
+          <w:szCs w:val="28"/>
+        </w:rPr>
+        <w:t xml:space="preserve"> Navigator</w:t>
+      </w:r>
+    </w:p>
+    <w:p>
+      <w:pPr>
+        <w:rPr>
+          <w:rFonts w:ascii="Arial" w:hAnsi="Arial"/>
+          <w:sz w:val="28"/>
+          <w:szCs w:val="28"/>
+        </w:rPr>
+      </w:pPr>
+      <w:r>
+        <w:rPr>
+          <w:rFonts w:ascii="Arial" w:hAnsi="Arial"/>
+          <w:sz w:val="28"/>
+          <w:szCs w:val="28"/>
+        </w:rPr>
+        <w:t>Menu na parte inferior para navegação.</w:t>
+      </w:r>
+    </w:p>
+    <w:p>
+      <w:pPr>
+        <w:rPr>
+          <w:rFonts w:ascii="Arial" w:hAnsi="Arial"/>
+          <w:sz w:val="28"/>
+          <w:szCs w:val="28"/>
+        </w:rPr>
+      </w:pPr>
+      <w:r>
+        <w:rPr>
+          <w:rFonts w:ascii="Arial" w:hAnsi="Arial"/>
+          <w:sz w:val="28"/>
+          <w:szCs w:val="28"/>
+        </w:rPr>
+        <w:t>Comando para baixar dependências e utilizar:</w:t>
+      </w:r>
+    </w:p>
+    <w:p>
+      <w:pPr>
+        <w:rPr>
+          <w:rFonts w:ascii="Arial" w:hAnsi="Arial"/>
+          <w:b/>
+          <w:bCs/>
+          <w:sz w:val="28"/>
+          <w:szCs w:val="28"/>
+          <w:lang w:val="en-US"/>
+        </w:rPr>
+      </w:pPr>
+      <w:r>
+        <w:rPr>
+          <w:rFonts w:ascii="Arial" w:hAnsi="Arial"/>
+          <w:b/>
+          <w:bCs/>
+          <w:sz w:val="28"/>
+          <w:szCs w:val="28"/>
+          <w:lang w:val="en-US"/>
+        </w:rPr>
+        <w:t>npm install @react-navigation/bottom-tabs</w:t>
+      </w:r>
+    </w:p>
+    <w:p>
+      <w:pPr>
+        <w:rPr>
+          <w:rFonts w:ascii="Arial" w:hAnsi="Arial"/>
+          <w:sz w:val="28"/>
+          <w:szCs w:val="28"/>
+          <w:lang w:val="en-US"/>
+        </w:rPr>
+      </w:pPr>
+      <w:r>
+        <w:rPr>
+          <w:rFonts w:ascii="Arial" w:hAnsi="Arial"/>
+          <w:sz w:val="28"/>
+          <w:szCs w:val="28"/>
+          <w:lang w:val="en-US"/>
+        </w:rPr>
+        <w:drawing>
+          <wp:inline distT="0" distB="0" distL="0" distR="0" wp14:anchorId="0A8EB50A" wp14:editId="1FC3E7E6">
+            <wp:extent cx="4315427" cy="762106"/>
+            <wp:effectExtent l="0" t="0" r="9525" b="0"/>
+            <wp:docPr id="1984431000" name="Imagem 1"/>
+            <wp:cNvGraphicFramePr>
+              <a:graphicFrameLocks xmlns:a="http://schemas.openxmlformats.org/drawingml/2006/main" noChangeAspect="1"/>
+            </wp:cNvGraphicFramePr>
+            <a:graphic xmlns:a="http://schemas.openxmlformats.org/drawingml/2006/main">
+              <a:graphicData uri="http://schemas.openxmlformats.org/drawingml/2006/picture">
+                <pic:pic xmlns:pic="http://schemas.openxmlformats.org/drawingml/2006/picture">
+                  <pic:nvPicPr>
+                    <pic:cNvPr id="1984431000" name=""/>
+                    <pic:cNvPicPr/>
+                  </pic:nvPicPr>
+                  <pic:blipFill>
+                    <a:blip r:embed="rId14"/>
+                    <a:stretch>
+                      <a:fillRect/>
+                    </a:stretch>
+                  </pic:blipFill>
+                  <pic:spPr>
+                    <a:xfrm>
+                      <a:off x="0" y="0"/>
+                      <a:ext cx="4315427" cy="762106"/>
+                    </a:xfrm>
+                    <a:prstGeom prst="rect">
+                      <a:avLst/>
+                    </a:prstGeom>
+                  </pic:spPr>
+                </pic:pic>
+              </a:graphicData>
+            </a:graphic>
+          </wp:inline>
+        </w:drawing>
+      </w:r>
+    </w:p>
+    <w:p>
+      <w:pPr>
+        <w:rPr>
+          <w:rFonts w:ascii="Arial" w:hAnsi="Arial"/>
+          <w:sz w:val="28"/>
+          <w:szCs w:val="28"/>
+          <w:lang w:val="en-US"/>
+        </w:rPr>
+      </w:pPr>
+    </w:p>
+    <w:p>
+      <w:pPr>
+        <w:rPr>
+          <w:rFonts w:ascii="Arial" w:hAnsi="Arial"/>
+          <w:sz w:val="28"/>
+          <w:szCs w:val="28"/>
+        </w:rPr>
+      </w:pPr>
+      <w:r>
+        <w:rPr>
+          <w:rFonts w:ascii="Arial" w:hAnsi="Arial"/>
+          <w:sz w:val="28"/>
+          <w:szCs w:val="28"/>
+        </w:rPr>
+        <w:t>Nesse tipo de navegação, TODAS a</w:t>
+      </w:r>
+      <w:r>
+        <w:rPr>
+          <w:rFonts w:ascii="Arial" w:hAnsi="Arial"/>
+          <w:sz w:val="28"/>
+          <w:szCs w:val="28"/>
+        </w:rPr>
+        <w:t>s telas são carregadas no momento em que o app é renderizado.</w:t>
+      </w:r>
+    </w:p>
+    <w:p>
+      <w:pPr>
+        <w:rPr>
+          <w:rFonts w:ascii="Arial" w:hAnsi="Arial"/>
+          <w:sz w:val="28"/>
+          <w:szCs w:val="28"/>
+        </w:rPr>
+      </w:pPr>
+    </w:p>
+    <w:p>
+      <w:pPr>
+        <w:rPr>
+          <w:rFonts w:ascii="Arial" w:hAnsi="Arial"/>
+          <w:sz w:val="28"/>
+          <w:szCs w:val="28"/>
+        </w:rPr>
+      </w:pPr>
+      <w:r>
+        <w:rPr>
+          <w:rFonts w:ascii="Arial" w:hAnsi="Arial"/>
+          <w:sz w:val="28"/>
+          <w:szCs w:val="28"/>
+        </w:rPr>
+        <w:t>Também não são indicados os parâmetros nesse tipo de navegação</w:t>
+      </w:r>
+    </w:p>
+    <w:p>
+      <w:pPr>
+        <w:rPr>
+          <w:rFonts w:ascii="Arial" w:hAnsi="Arial"/>
+          <w:sz w:val="28"/>
+          <w:szCs w:val="28"/>
+        </w:rPr>
+      </w:pPr>
+    </w:p>
+    <w:p>
+      <w:pPr>
+        <w:rPr>
+          <w:rFonts w:ascii="Arial" w:hAnsi="Arial"/>
+          <w:b/>
+          <w:bCs/>
+          <w:sz w:val="28"/>
+          <w:szCs w:val="28"/>
+        </w:rPr>
+      </w:pPr>
+      <w:r>
+        <w:rPr>
+          <w:rFonts w:ascii="Arial" w:hAnsi="Arial"/>
+          <w:b/>
+          <w:bCs/>
+          <w:sz w:val="28"/>
+          <w:szCs w:val="28"/>
+        </w:rPr>
+        <w:t>Implementação</w:t>
+      </w:r>
+    </w:p>
+    <w:p>
+      <w:pPr>
+        <w:rPr>
+          <w:rFonts w:ascii="Arial" w:hAnsi="Arial"/>
+          <w:b/>
+          <w:bCs/>
+          <w:sz w:val="28"/>
+          <w:szCs w:val="28"/>
+        </w:rPr>
+      </w:pPr>
+      <w:r>
+        <w:rPr>
+          <w:rFonts w:ascii="Arial" w:hAnsi="Arial"/>
+          <w:b/>
+          <w:bCs/>
+          <w:sz w:val="28"/>
+          <w:szCs w:val="28"/>
+        </w:rPr>
+        <w:drawing>
+          <wp:inline distT="0" distB="0" distL="0" distR="0" wp14:anchorId="29BD2EEB" wp14:editId="59BDB1EE">
+            <wp:extent cx="5029902" cy="2276793"/>
+            <wp:effectExtent l="0" t="0" r="0" b="9525"/>
+            <wp:docPr id="295965010" name="Imagem 1"/>
+            <wp:cNvGraphicFramePr>
+              <a:graphicFrameLocks xmlns:a="http://schemas.openxmlformats.org/drawingml/2006/main" noChangeAspect="1"/>
+            </wp:cNvGraphicFramePr>
+            <a:graphic xmlns:a="http://schemas.openxmlformats.org/drawingml/2006/main">
+              <a:graphicData uri="http://schemas.openxmlformats.org/drawingml/2006/picture">
+                <pic:pic xmlns:pic="http://schemas.openxmlformats.org/drawingml/2006/picture">
+                  <pic:nvPicPr>
+                    <pic:cNvPr id="295965010" name=""/>
+                    <pic:cNvPicPr/>
+                  </pic:nvPicPr>
+                  <pic:blipFill>
+                    <a:blip r:embed="rId15"/>
+                    <a:stretch>
+                      <a:fillRect/>
+                    </a:stretch>
+                  </pic:blipFill>
+                  <pic:spPr>
+                    <a:xfrm>
+                      <a:off x="0" y="0"/>
+                      <a:ext cx="5029902" cy="2276793"/>
+                    </a:xfrm>
+                    <a:prstGeom prst="rect">
+                      <a:avLst/>
+                    </a:prstGeom>
+                  </pic:spPr>
+                </pic:pic>
+              </a:graphicData>
+            </a:graphic>
+          </wp:inline>
+        </w:drawing>
+      </w:r>
+    </w:p>
+    <w:p>
+      <w:pPr>
+        <w:rPr>
+          <w:rFonts w:ascii="Arial" w:hAnsi="Arial"/>
+          <w:sz w:val="28"/>
+          <w:szCs w:val="28"/>
+        </w:rPr>
+      </w:pPr>
+    </w:p>
+    <w:p>
+      <w:pPr>
+        <w:rPr>
+          <w:rFonts w:ascii="Arial" w:hAnsi="Arial"/>
+          <w:sz w:val="28"/>
+          <w:szCs w:val="28"/>
+        </w:rPr>
+      </w:pPr>
+    </w:p>
+    <w:p>
+      <w:pPr>
+        <w:rPr>
+          <w:rFonts w:ascii="Arial" w:hAnsi="Arial"/>
+          <w:sz w:val="28"/>
+          <w:szCs w:val="28"/>
+        </w:rPr>
+      </w:pPr>
+    </w:p>
+    <w:p>
+      <w:pPr>
+        <w:rPr>
+          <w:rFonts w:ascii="Arial" w:hAnsi="Arial"/>
+          <w:sz w:val="28"/>
+          <w:szCs w:val="28"/>
+        </w:rPr>
+      </w:pPr>
+    </w:p>
+    <w:p>
+      <w:pPr>
+        <w:rPr>
+          <w:rFonts w:ascii="Arial" w:hAnsi="Arial"/>
+          <w:sz w:val="28"/>
+          <w:szCs w:val="28"/>
+        </w:rPr>
+      </w:pPr>
+    </w:p>
+    <w:p>
+      <w:pPr>
+        <w:rPr>
+          <w:rFonts w:ascii="Arial" w:hAnsi="Arial"/>
+          <w:sz w:val="28"/>
+          <w:szCs w:val="28"/>
+        </w:rPr>
+      </w:pPr>
+    </w:p>
+    <w:p>
+      <w:pPr>
+        <w:rPr>
+          <w:rFonts w:ascii="Arial" w:hAnsi="Arial"/>
+          <w:b/>
+          <w:bCs/>
+          <w:sz w:val="28"/>
+          <w:szCs w:val="28"/>
+        </w:rPr>
+      </w:pPr>
+      <w:r>
+        <w:rPr>
+          <w:rFonts w:ascii="Arial" w:hAnsi="Arial"/>
+          <w:b/>
+          <w:bCs/>
+          <w:sz w:val="28"/>
+          <w:szCs w:val="28"/>
+        </w:rPr>
+        <w:lastRenderedPageBreak/>
+        <w:t>Drawer Navigator</w:t>
+      </w:r>
+    </w:p>
+    <w:p>
+      <w:pPr>
+        <w:rPr>
+          <w:rFonts w:ascii="Arial" w:hAnsi="Arial"/>
+          <w:sz w:val="28"/>
+          <w:szCs w:val="28"/>
+        </w:rPr>
+      </w:pPr>
+      <w:r>
+        <w:rPr>
+          <w:rFonts w:ascii="Arial" w:hAnsi="Arial"/>
+          <w:sz w:val="28"/>
+          <w:szCs w:val="28"/>
+        </w:rPr>
+        <w:t>Navegador lat</w:t>
+      </w:r>
+      <w:r>
+        <w:rPr>
+          <w:rFonts w:ascii="Arial" w:hAnsi="Arial"/>
+          <w:sz w:val="28"/>
+          <w:szCs w:val="28"/>
+        </w:rPr>
+        <w:t>eral como no Discord.</w:t>
+      </w:r>
+    </w:p>
+    <w:p>
+      <w:pPr>
+        <w:rPr>
+          <w:rFonts w:ascii="Arial" w:hAnsi="Arial"/>
+          <w:sz w:val="28"/>
+          <w:szCs w:val="28"/>
+        </w:rPr>
+      </w:pPr>
+      <w:r>
+        <w:rPr>
+          <w:rFonts w:ascii="Arial" w:hAnsi="Arial"/>
+          <w:sz w:val="28"/>
+          <w:szCs w:val="28"/>
+        </w:rPr>
+        <w:drawing>
+          <wp:inline distT="0" distB="0" distL="0" distR="0" wp14:anchorId="693DDEE1" wp14:editId="059C39E7">
+            <wp:extent cx="2391109" cy="3115110"/>
+            <wp:effectExtent l="0" t="0" r="9525" b="9525"/>
+            <wp:docPr id="1064364003" name="Imagem 1"/>
+            <wp:cNvGraphicFramePr>
+              <a:graphicFrameLocks xmlns:a="http://schemas.openxmlformats.org/drawingml/2006/main" noChangeAspect="1"/>
+            </wp:cNvGraphicFramePr>
+            <a:graphic xmlns:a="http://schemas.openxmlformats.org/drawingml/2006/main">
+              <a:graphicData uri="http://schemas.openxmlformats.org/drawingml/2006/picture">
+                <pic:pic xmlns:pic="http://schemas.openxmlformats.org/drawingml/2006/picture">
+                  <pic:nvPicPr>
+                    <pic:cNvPr id="1064364003" name=""/>
+                    <pic:cNvPicPr/>
+                  </pic:nvPicPr>
+                  <pic:blipFill>
+                    <a:blip r:embed="rId16"/>
+                    <a:stretch>
+                      <a:fillRect/>
+                    </a:stretch>
+                  </pic:blipFill>
+                  <pic:spPr>
+                    <a:xfrm>
+                      <a:off x="0" y="0"/>
+                      <a:ext cx="2391109" cy="3115110"/>
+                    </a:xfrm>
+                    <a:prstGeom prst="rect">
+                      <a:avLst/>
+                    </a:prstGeom>
+                  </pic:spPr>
+                </pic:pic>
+              </a:graphicData>
+            </a:graphic>
+          </wp:inline>
+        </w:drawing>
+      </w:r>
+    </w:p>
+    <w:p>
+      <w:pPr>
+        <w:rPr>
+          <w:rFonts w:ascii="Arial" w:hAnsi="Arial"/>
+          <w:sz w:val="28"/>
+          <w:szCs w:val="28"/>
+        </w:rPr>
+      </w:pPr>
+      <w:r>
+        <w:rPr>
+          <w:rFonts w:ascii="Arial" w:hAnsi="Arial"/>
+          <w:sz w:val="28"/>
+          <w:szCs w:val="28"/>
+        </w:rPr>
+        <w:t>Instalação:</w:t>
+      </w:r>
+    </w:p>
+    <w:p>
+      <w:pPr>
+        <w:rPr>
+          <w:rFonts w:ascii="Arial" w:hAnsi="Arial"/>
+          <w:sz w:val="28"/>
+          <w:szCs w:val="28"/>
+          <w:lang w:val="en-US"/>
+        </w:rPr>
+      </w:pPr>
+      <w:r>
+        <w:rPr>
+          <w:rFonts w:ascii="Arial" w:hAnsi="Arial"/>
+          <w:sz w:val="28"/>
+          <w:szCs w:val="28"/>
+          <w:lang w:val="en-US"/>
+        </w:rPr>
+        <w:t>npm install @react-navigation/drawer</w:t>
+      </w:r>
+    </w:p>
+    <w:p>
+      <w:pPr>
+        <w:rPr>
+          <w:rFonts w:ascii="Arial" w:hAnsi="Arial"/>
+          <w:sz w:val="28"/>
+          <w:szCs w:val="28"/>
+          <w:lang w:val="en-US"/>
+        </w:rPr>
+      </w:pPr>
+      <w:r>
+        <w:rPr>
+          <w:rFonts w:ascii="Arial" w:hAnsi="Arial"/>
+          <w:sz w:val="28"/>
+          <w:szCs w:val="28"/>
+          <w:lang w:val="en-US"/>
+        </w:rPr>
+        <w:t>npx expo install react-native-gesture-handler react-native-reanimated react-native-worklets</w:t>
+      </w:r>
+    </w:p>
+    <w:p>
+      <w:pPr>
+        <w:rPr>
+          <w:rFonts w:ascii="Arial" w:hAnsi="Arial"/>
+          <w:sz w:val="28"/>
+          <w:szCs w:val="28"/>
+          <w:lang w:val="en-US"/>
+        </w:rPr>
+      </w:pPr>
+      <w:r>
+        <w:rPr>
+          <w:rFonts w:ascii="Arial" w:hAnsi="Arial"/>
+          <w:sz w:val="28"/>
+          <w:szCs w:val="28"/>
+          <w:lang w:val="en-US"/>
+        </w:rPr>
+        <w:t>npm install babel-preset-expo</w:t>
+      </w:r>
+    </w:p>
+    <w:p>
+      <w:pPr>
+        <w:rPr>
+          <w:rFonts w:ascii="Arial" w:hAnsi="Arial"/>
+          <w:sz w:val="28"/>
+          <w:szCs w:val="28"/>
+          <w:lang w:val="en-US"/>
+        </w:rPr>
+      </w:pPr>
+    </w:p>
+    <w:p>
+      <w:pPr>
+        <w:rPr>
+          <w:rFonts w:ascii="Arial" w:hAnsi="Arial"/>
+          <w:sz w:val="28"/>
+          <w:szCs w:val="28"/>
+        </w:rPr>
+      </w:pPr>
+      <w:r>
+        <w:rPr>
+          <w:rFonts w:ascii="Arial" w:hAnsi="Arial"/>
+          <w:sz w:val="28"/>
+          <w:szCs w:val="28"/>
+        </w:rPr>
+        <w:t>Para rodar, devemos criar um a</w:t>
+      </w:r>
+      <w:r>
+        <w:rPr>
+          <w:rFonts w:ascii="Arial" w:hAnsi="Arial"/>
+          <w:sz w:val="28"/>
+          <w:szCs w:val="28"/>
+        </w:rPr>
+        <w:t>rquivo de configuração:</w:t>
+      </w:r>
+    </w:p>
+    <w:p>
+      <w:pPr>
+        <w:rPr>
+          <w:rFonts w:ascii="Arial" w:hAnsi="Arial"/>
+          <w:sz w:val="28"/>
+          <w:szCs w:val="28"/>
+        </w:rPr>
+      </w:pPr>
+      <w:r>
+        <w:rPr>
+          <w:rFonts w:ascii="Arial" w:hAnsi="Arial"/>
+          <w:sz w:val="28"/>
+          <w:szCs w:val="28"/>
+        </w:rPr>
+        <w:drawing>
+          <wp:inline distT="0" distB="0" distL="0" distR="0" wp14:anchorId="6C99CCE0" wp14:editId="4A9FD842">
+            <wp:extent cx="5400040" cy="1025525"/>
+            <wp:effectExtent l="0" t="0" r="0" b="3175"/>
+            <wp:docPr id="932336597" name="Imagem 1"/>
+            <wp:cNvGraphicFramePr>
+              <a:graphicFrameLocks xmlns:a="http://schemas.openxmlformats.org/drawingml/2006/main" noChangeAspect="1"/>
+            </wp:cNvGraphicFramePr>
+            <a:graphic xmlns:a="http://schemas.openxmlformats.org/drawingml/2006/main">
+              <a:graphicData uri="http://schemas.openxmlformats.org/drawingml/2006/picture">
+                <pic:pic xmlns:pic="http://schemas.openxmlformats.org/drawingml/2006/picture">
+                  <pic:nvPicPr>
+                    <pic:cNvPr id="932336597" name=""/>
+                    <pic:cNvPicPr/>
+                  </pic:nvPicPr>
+                  <pic:blipFill>
+                    <a:blip r:embed="rId17"/>
+                    <a:stretch>
+                      <a:fillRect/>
+                    </a:stretch>
+                  </pic:blipFill>
+                  <pic:spPr>
+                    <a:xfrm>
+                      <a:off x="0" y="0"/>
+                      <a:ext cx="5400040" cy="1025525"/>
+                    </a:xfrm>
+                    <a:prstGeom prst="rect">
+                      <a:avLst/>
+                    </a:prstGeom>
+                  </pic:spPr>
+                </pic:pic>
+              </a:graphicData>
+            </a:graphic>
+          </wp:inline>
+        </w:drawing>
+      </w:r>
+    </w:p>
+    <w:p>
+      <w:pPr>
+        <w:rPr>
+          <w:rFonts w:ascii="Arial" w:hAnsi="Arial"/>
+          <w:sz w:val="28"/>
+          <w:szCs w:val="28"/>
+        </w:rPr>
+      </w:pPr>
+    </w:p>
+    <w:p>
+      <w:pPr>
+        <w:rPr>
+          <w:rFonts w:ascii="Arial" w:hAnsi="Arial"/>
+          <w:sz w:val="28"/>
+          <w:szCs w:val="28"/>
+        </w:rPr>
+      </w:pPr>
+    </w:p>
+    <w:p>
+      <w:pPr>
+        <w:rPr>
+          <w:rFonts w:ascii="Arial" w:hAnsi="Arial"/>
+          <w:sz w:val="28"/>
+          <w:szCs w:val="28"/>
+        </w:rPr>
+      </w:pPr>
+    </w:p>
+    <w:p>
+      <w:pPr>
+        <w:rPr>
+          <w:rFonts w:ascii="Arial" w:hAnsi="Arial"/>
+          <w:sz w:val="28"/>
+          <w:szCs w:val="28"/>
+        </w:rPr>
+      </w:pPr>
+    </w:p>
+    <w:p>
+      <w:pPr>
+        <w:rPr>
+          <w:rFonts w:ascii="Arial" w:hAnsi="Arial"/>
+          <w:sz w:val="28"/>
+          <w:szCs w:val="28"/>
+        </w:rPr>
+      </w:pPr>
+      <w:r>
+        <w:rPr>
+          <w:rFonts w:ascii="Arial" w:hAnsi="Arial"/>
+          <w:sz w:val="28"/>
+          <w:szCs w:val="28"/>
+        </w:rPr>
+        <w:lastRenderedPageBreak/>
+        <w:t>Implementação</w:t>
+      </w:r>
+    </w:p>
+    <w:p>
+      <w:pPr>
+        <w:rPr>
+          <w:rFonts w:ascii="Arial" w:hAnsi="Arial"/>
+          <w:sz w:val="28"/>
+          <w:szCs w:val="28"/>
+        </w:rPr>
+      </w:pPr>
+      <w:r>
+        <w:rPr>
+          <w:rFonts w:ascii="Arial" w:hAnsi="Arial"/>
+          <w:sz w:val="28"/>
+          <w:szCs w:val="28"/>
+        </w:rPr>
+        <w:drawing>
+          <wp:inline distT="0" distB="0" distL="0" distR="0" wp14:anchorId="65B1BBD5" wp14:editId="6E7FBBB5">
+            <wp:extent cx="5344271" cy="2543530"/>
+            <wp:effectExtent l="0" t="0" r="8890" b="9525"/>
+            <wp:docPr id="1954168736" name="Imagem 1"/>
+            <wp:cNvGraphicFramePr>
+              <a:graphicFrameLocks xmlns:a="http://schemas.openxmlformats.org/drawingml/2006/main" noChangeAspect="1"/>
+            </wp:cNvGraphicFramePr>
+            <a:graphic xmlns:a="http://schemas.openxmlformats.org/drawingml/2006/main">
+              <a:graphicData uri="http://schemas.openxmlformats.org/drawingml/2006/picture">
+                <pic:pic xmlns:pic="http://schemas.openxmlformats.org/drawingml/2006/picture">
+                  <pic:nvPicPr>
+                    <pic:cNvPr id="1954168736" name=""/>
+                    <pic:cNvPicPr/>
+                  </pic:nvPicPr>
+                  <pic:blipFill>
+                    <a:blip r:embed="rId18"/>
+                    <a:stretch>
+                      <a:fillRect/>
+                    </a:stretch>
+                  </pic:blipFill>
+                  <pic:spPr>
+                    <a:xfrm>
+                      <a:off x="0" y="0"/>
+                      <a:ext cx="5344271" cy="2543530"/>
+                    </a:xfrm>
+                    <a:prstGeom prst="rect">
+                      <a:avLst/>
+                    </a:prstGeom>
+                  </pic:spPr>
+                </pic:pic>
+              </a:graphicData>
+            </a:graphic>
+          </wp:inline>
+        </w:drawing>
+      </w:r>
+    </w:p>
+    <w:p>
+      <w:pPr>
+        <w:rPr>
+          <w:rFonts w:ascii="Arial" w:hAnsi="Arial"/>
+          <w:sz w:val="28"/>
+          <w:szCs w:val="28"/>
+        </w:rPr>
+      </w:pPr>
+    </w:p>
+    <w:p>
+      <w:pPr>
+        <w:rPr>
+          <w:rFonts w:ascii="Arial" w:hAnsi="Arial"/>
+          <w:b/>
+          <w:bCs/>
+          <w:sz w:val="28"/>
+          <w:szCs w:val="28"/>
+        </w:rPr>
+      </w:pPr>
+      <w:r>
+        <w:rPr>
+          <w:rFonts w:ascii="Arial" w:hAnsi="Arial"/>
+          <w:b/>
+          <w:bCs/>
+          <w:sz w:val="28"/>
+          <w:szCs w:val="28"/>
+        </w:rPr>
+        <w:t>Quando usar cada um?</w:t>
+      </w:r>
+    </w:p>
+    <w:p>
+      <w:pPr>
+        <w:rPr>
+          <w:rFonts w:ascii="Arial" w:hAnsi="Arial"/>
+          <w:sz w:val="28"/>
+          <w:szCs w:val="28"/>
+        </w:rPr>
+      </w:pPr>
+      <w:r>
+        <w:rPr>
+          <w:rFonts w:ascii="Arial" w:hAnsi="Arial"/>
+          <w:sz w:val="28"/>
+          <w:szCs w:val="28"/>
+        </w:rPr>
+        <w:drawing>
+          <wp:inline distT="0" distB="0" distL="0" distR="0" wp14:anchorId="250F8858" wp14:editId="6A47EAE3">
+            <wp:extent cx="5400040" cy="1575435"/>
+            <wp:effectExtent l="0" t="0" r="0" b="5715"/>
+            <wp:docPr id="1680178720" name="Imagem 1"/>
+            <wp:cNvGraphicFramePr>
+              <a:graphicFrameLocks xmlns:a="http://schemas.openxmlformats.org/drawingml/2006/main" noChangeAspect="1"/>
+            </wp:cNvGraphicFramePr>
+            <a:graphic xmlns:a="http://schemas.openxmlformats.org/drawingml/2006/main">
+              <a:graphicData uri="http://schemas.openxmlformats.org/drawingml/2006/picture">
+                <pic:pic xmlns:pic="http://schemas.openxmlformats.org/drawingml/2006/picture">
+                  <pic:nvPicPr>
+                    <pic:cNvPr id="1680178720" name=""/>
+                    <pic:cNvPicPr/>
+                  </pic:nvPicPr>
+                  <pic:blipFill>
+                    <a:blip r:embed="rId19"/>
+                    <a:stretch>
+                      <a:fillRect/>
+                    </a:stretch>
+                  </pic:blipFill>
+                  <pic:spPr>
+                    <a:xfrm>
+                      <a:off x="0" y="0"/>
+                      <a:ext cx="5400040" cy="1575435"/>
                     </a:xfrm>
                     <a:prstGeom prst="rect">
                       <a:avLst/>

</xml_diff>